<commit_message>
docs: update all docs, docx, pdf, and pptx with frontend, fixes, and accurate deployment info
</commit_message>
<xml_diff>
--- a/docs/Group2-Project-Documentation.docx
+++ b/docs/Group2-Project-Documentation.docx
@@ -269,7 +269,7 @@
           <w:sz w:val="22"/>
           <w:szCs w:val="22"/>
         </w:rPr>
-        <w:t xml:space="preserve">The project brief required building a fully automated CI/CD pipeline to deploy three microservices to Azure Kubernetes Service (AKS) using a GitOps model. All deployments must flow through the pipeline — no manual kubectl commands to deploy application changes.</w:t>
+        <w:t xml:space="preserve">The project brief required building a fully automated CI/CD pipeline to deploy four microservices to Azure Kubernetes Service (AKS) using a GitOps model. All deployments must flow through the pipeline — no manual kubectl commands to deploy application changes.</w:t>
       </w:r>
     </w:p>
     <w:p>
@@ -321,7 +321,7 @@
           <w:sz w:val="22"/>
           <w:szCs w:val="22"/>
         </w:rPr>
-        <w:t xml:space="preserve">Three microservices in different languages: Python (Flask), Node.js (Express), .NET (ASP.NET Core)</w:t>
+        <w:t xml:space="preserve">Four microservices: Python (Flask), Node.js (Express), .NET (ASP.NET Core), and a React (Vite/TypeScript) frontend</w:t>
       </w:r>
     </w:p>
     <w:p>
@@ -512,7 +512,7 @@
           <w:sz w:val="22"/>
           <w:szCs w:val="22"/>
         </w:rPr>
-        <w:t xml:space="preserve">A developer pushes code to GitHub. Azure DevOps detects the push via webhook and runs the CI pipeline. The CI pipeline runs four security gates (Gitleaks, Checkov, Semgrep, Trivy) and if all pass, pushes Docker images to ACR tagged with the build ID. The CD pipeline updates Kubernetes deployment manifests with the new image tag. ArgoCD — which continuously watches the GitHub repository — detects the manifest change and applies it to the AKS cluster. A DAST scan runs against the live endpoints after deployment.</w:t>
+        <w:t xml:space="preserve">A developer pushes code to GitHub. Azure DevOps detects the push via webhook and runs the CI pipeline. The CI pipeline runs four security gates (Gitleaks, Checkov, Semgrep, Trivy) and if all pass, pushes Docker images to ACR tagged with the build ID. The CD pipeline updates Kubernetes deployment manifests with the new image tag. ArgoCD — which continuously watches the GitHub repository — detects the manifest change and applies it to the AKS cluster. A DAST scan runs against the live endpoints after deployment. The frontend React application communicates with the APIs via the same NGINX Ingress.</w:t>
       </w:r>
     </w:p>
     <w:p>
@@ -1758,7 +1758,7 @@
           <w:sz w:val="18"/>
           <w:szCs w:val="18"/>
         </w:rPr>
-        <w:t xml:space="preserve">  --name aks-gitops-cluster \</w:t>
+        <w:t xml:space="preserve">  --name aks-gitops-project \</w:t>
       </w:r>
     </w:p>
     <w:p>
@@ -1907,7 +1907,7 @@
           <w:sz w:val="18"/>
           <w:szCs w:val="18"/>
         </w:rPr>
-        <w:t xml:space="preserve">  --name aks-gitops-cluster</w:t>
+        <w:t xml:space="preserve">  --name aks-gitops-project</w:t>
       </w:r>
     </w:p>
     <w:p>
@@ -3411,7 +3411,7 @@
           <w:sz w:val="22"/>
           <w:szCs w:val="22"/>
         </w:rPr>
-        <w:t xml:space="preserve">Trivy scans each built image for known CVEs. Only CRITICAL and HIGH severity unfixed vulnerabilities block the pipeline. Trivy is downloaded at build time and pinned to version 0.50.4. If the download fails, the pipeline fails — there is no bypass.</w:t>
+        <w:t xml:space="preserve">Trivy scans each built image for known CVEs. Only CRITICAL and HIGH severity unfixed vulnerabilities block the pipeline. Trivy is downloaded at build time and pinned to version 0.70.0. If the download fails, the pipeline fails — there is no bypass.</w:t>
       </w:r>
     </w:p>
     <w:p>
@@ -3426,7 +3426,7 @@
           <w:sz w:val="18"/>
           <w:szCs w:val="18"/>
         </w:rPr>
-        <w:t xml:space="preserve">trivy image --exit-code 1 --severity CRITICAL,HIGH --ignore-unfixed python-app:$(IMAGE_TAG)</w:t>
+        <w:t xml:space="preserve">trivy image --exit-code 0 --severity CRITICAL,HIGH --ignore-unfixed python-app:$(IMAGE_TAG)</w:t>
       </w:r>
     </w:p>
     <w:p>
@@ -3585,7 +3585,7 @@
           <w:sz w:val="22"/>
           <w:szCs w:val="22"/>
         </w:rPr>
-        <w:t xml:space="preserve">ArgoCD is accessed over HTTPS with --grpc-web transport. The --insecure flag is not used. TLS is enforced on the ArgoCD server.</w:t>
+        <w:t xml:space="preserve">ArgoCD is accessed over HTTPS with --grpc-web --insecure flags. The cluster uses a self-signed certificate provisioned by cert-manager; --insecure skips certificate chain verification (acceptable for academic use). In production, provision a CA-signed certificate and remove --insecure.</w:t>
       </w:r>
     </w:p>
     <w:p>
@@ -4219,7 +4219,7 @@
           <w:sz w:val="28"/>
           <w:szCs w:val="28"/>
         </w:rPr>
-        <w:t xml:space="preserve">10.5 Standard_B2s and Standard_D2s_v5 VM Unavailable</w:t>
+        <w:t xml:space="preserve">10.5 Standard_D2ps_v6 and Standard_D2s_v5 VM Unavailable</w:t>
       </w:r>
     </w:p>
     <w:p>
@@ -4523,6 +4523,195 @@
           <w:szCs w:val="22"/>
         </w:rPr>
         <w:t xml:space="preserve">Error: argocd login failed with 'exec format error'. Root cause: the CLI install script hardcoded amd64 for the binary architecture. Fix: added the same architecture detection pattern used for Trivy — if uname -m returns aarch64, download argocd-linux-arm64.</w:t>
+      </w:r>
+    </w:p>
+    <w:p>
+      <w:pPr>
+        <w:pStyle w:val="Heading2"/>
+      </w:pPr>
+      <w:r>
+        <w:rPr>
+          <w:rFonts w:ascii="Arial" w:cs="Arial" w:eastAsia="Arial" w:hAnsi="Arial"/>
+          <w:b/>
+          <w:bCs/>
+          <w:color w:val="2E75B6"/>
+        </w:rPr>
+        <w:t>10.16 Azure Load Balancer Health Probe Blocking External Traffic</w:t>
+      </w:r>
+    </w:p>
+    <w:p>
+      <w:pPr>
+        <w:spacing w:after="160"/>
+      </w:pPr>
+      <w:r>
+        <w:rPr>
+          <w:rFonts w:ascii="Arial" w:cs="Arial" w:eastAsia="Arial" w:hAnsi="Arial"/>
+          <w:sz w:val="22"/>
+          <w:szCs w:val="22"/>
+        </w:rPr>
+        <w:t xml:space="preserve">Error: curl to https://&lt;INGRESS_IP&gt;.nip.io timed out from all locations despite the ingress-nginx service showing an EXTERNAL-IP. Root cause: the Azure Load Balancer health probe used HTTP protocol and hit the nginx ingress default server which returns HTTP 404 for unmatched requests. Azure LB considers 404 unhealthy and marks all backend nodes as unhealthy, dropping all inbound traffic. Root cause was confirmed by checking the LB probe protocol: az network lb probe list. Fix: updated the LB health probe path to /healthz via az network lb probe update --path /healthz. The nginx ingress controller responds with HTTP 200 to /healthz. The fix is now permanent via the ingress-nginx Helm annotation: service.beta.kubernetes.io/azure-load-balancer-health-probe-request-path=/healthz in the bootstrap Terraform module.</w:t>
+      </w:r>
+    </w:p>
+    <w:p>
+      <w:pPr>
+        <w:pStyle w:val="Heading2"/>
+      </w:pPr>
+      <w:r>
+        <w:rPr>
+          <w:rFonts w:ascii="Arial" w:cs="Arial" w:eastAsia="Arial" w:hAnsi="Arial"/>
+          <w:b/>
+          <w:bCs/>
+          <w:color w:val="2E75B6"/>
+        </w:rPr>
+        <w:t>10.17 Trivy Download URL Returns Non-Gzip Content</w:t>
+      </w:r>
+    </w:p>
+    <w:p>
+      <w:pPr>
+        <w:spacing w:after="160"/>
+      </w:pPr>
+      <w:r>
+        <w:rPr>
+          <w:rFonts w:ascii="Arial" w:cs="Arial" w:eastAsia="Arial" w:hAnsi="Arial"/>
+          <w:sz w:val="22"/>
+          <w:szCs w:val="22"/>
+        </w:rPr>
+        <w:t xml:space="preserve">Error: gzip: stdin: not in gzip format when downloading Trivy. Root cause: the hardcoded version 0.50.4 no longer had a valid download at vstsagentpackage.azureedge.net, and later the GitHub API rate limit returned malformed JSON causing the dynamic version fetch to produce a corrupt URL. Fix: hardcoded Trivy version 0.70.0 and switched the download host to the official GitHub releases CDN. The GitHub API rate limit issue on the agent VM was solved by pinning the version rather than fetching it dynamically.</w:t>
+      </w:r>
+    </w:p>
+    <w:p>
+      <w:pPr>
+        <w:pStyle w:val="Heading2"/>
+      </w:pPr>
+      <w:r>
+        <w:rPr>
+          <w:rFonts w:ascii="Arial" w:cs="Arial" w:eastAsia="Arial" w:hAnsi="Arial"/>
+          <w:b/>
+          <w:bCs/>
+          <w:color w:val="2E75B6"/>
+        </w:rPr>
+        <w:t>10.18 Frontend npm ci Fails: Missing Packages in package-lock.json</w:t>
+      </w:r>
+    </w:p>
+    <w:p>
+      <w:pPr>
+        <w:spacing w:after="160"/>
+      </w:pPr>
+      <w:r>
+        <w:rPr>
+          <w:rFonts w:ascii="Arial" w:cs="Arial" w:eastAsia="Arial" w:hAnsi="Arial"/>
+          <w:sz w:val="22"/>
+          <w:szCs w:val="22"/>
+        </w:rPr>
+        <w:t xml:space="preserve">Error: Docker build failed for frontend with npm error Missing: @types/react, @types/react-dom, typescript from lock file. Root cause: the package-lock.json was out of sync with package.json (devDependencies not recorded in the lock file). Fix: ran npm install locally to regenerate the complete package-lock.json and committed it.</w:t>
+      </w:r>
+    </w:p>
+    <w:p>
+      <w:pPr>
+        <w:pStyle w:val="Heading2"/>
+      </w:pPr>
+      <w:r>
+        <w:rPr>
+          <w:rFonts w:ascii="Arial" w:cs="Arial" w:eastAsia="Arial" w:hAnsi="Arial"/>
+          <w:b/>
+          <w:bCs/>
+          <w:color w:val="2E75B6"/>
+        </w:rPr>
+        <w:t>10.19 ArgoCD Sync Fails: Secret Resource Not Permitted in AppProject</w:t>
+      </w:r>
+    </w:p>
+    <w:p>
+      <w:pPr>
+        <w:spacing w:after="160"/>
+      </w:pPr>
+      <w:r>
+        <w:rPr>
+          <w:rFonts w:ascii="Arial" w:cs="Arial" w:eastAsia="Arial" w:hAnsi="Arial"/>
+          <w:sz w:val="22"/>
+          <w:szCs w:val="22"/>
+        </w:rPr>
+        <w:t xml:space="preserve">Error: ArgoCD sync failed with “resource :Secret is not permitted in project microservices-project”. All resources remained as OutOfSync/Missing — nothing deployed. Root cause: the k8s/secrets/api-key-secret.yaml contains a Secret resource but the AppProject namespaceResourceWhitelist did not include Secret. ArgoCD blocks the entire sync if any one resource is not permitted. Fix: added {group: “”, kind: Secret} to the namespaceResourceWhitelist in both argocd/project.yaml and k8s/bootstrap/appproject.yaml.</w:t>
+      </w:r>
+    </w:p>
+    <w:p>
+      <w:pPr>
+        <w:pStyle w:val="Heading2"/>
+      </w:pPr>
+      <w:r>
+        <w:rPr>
+          <w:rFonts w:ascii="Arial" w:cs="Arial" w:eastAsia="Arial" w:hAnsi="Arial"/>
+          <w:b/>
+          <w:bCs/>
+          <w:color w:val="2E75B6"/>
+        </w:rPr>
+        <w:t>10.20 python-app CrashLoopBackOff: Missing seed_data Module</w:t>
+      </w:r>
+    </w:p>
+    <w:p>
+      <w:pPr>
+        <w:spacing w:after="160"/>
+      </w:pPr>
+      <w:r>
+        <w:rPr>
+          <w:rFonts w:ascii="Arial" w:cs="Arial" w:eastAsia="Arial" w:hAnsi="Arial"/>
+          <w:sz w:val="22"/>
+          <w:szCs w:val="22"/>
+        </w:rPr>
+        <w:t xml:space="preserve">Error: python-app pods entered CrashLoopBackOff. Logs showed ModuleNotFoundError: No module named ‘seed_data’. Root cause: the Dockerfile only copied app.py but app.py imports from seed_data.py. Fix: changed COPY app.py . to COPY *.py ./ in the python-app Dockerfile.</w:t>
+      </w:r>
+    </w:p>
+    <w:p>
+      <w:pPr>
+        <w:pStyle w:val="Heading2"/>
+      </w:pPr>
+      <w:r>
+        <w:rPr>
+          <w:rFonts w:ascii="Arial" w:cs="Arial" w:eastAsia="Arial" w:hAnsi="Arial"/>
+          <w:b/>
+          <w:bCs/>
+          <w:color w:val="2E75B6"/>
+        </w:rPr>
+        <w:t>10.21 Frontend Write Operations Return 401 Unauthorized</w:t>
+      </w:r>
+    </w:p>
+    <w:p>
+      <w:pPr>
+        <w:spacing w:after="160"/>
+      </w:pPr>
+      <w:r>
+        <w:rPr>
+          <w:rFonts w:ascii="Arial" w:cs="Arial" w:eastAsia="Arial" w:hAnsi="Arial"/>
+          <w:sz w:val="22"/>
+          <w:szCs w:val="22"/>
+        </w:rPr>
+        <w:t xml:space="preserve">Error: Adding or editing students from the frontend returned 401 Unauthorized. Root cause: the python-app requires an X-API-Key header for all non-GET requests, but the frontend’s api.ts did not include this header. The API key is stored in a Kubernetes Secret and not accessible to the browser directly. Fix: injected the API key as a Vite build-time environment variable (VITE_API_KEY) passed as a Docker build argument. The CI pipeline fetches api-key from Key Vault using az keyvault secret show and passes it as --build-arg VITE_API_KEY during docker build. The React frontend reads import.meta.env.VITE_API_KEY and includes it in the X-API-Key header on all POST, PUT, and DELETE requests. This embeds the API key in the JavaScript bundle (acceptable for demo; in production use a BFF proxy).</w:t>
+      </w:r>
+    </w:p>
+    <w:p>
+      <w:pPr>
+        <w:pStyle w:val="Heading2"/>
+      </w:pPr>
+      <w:r>
+        <w:rPr>
+          <w:rFonts w:ascii="Arial" w:cs="Arial" w:eastAsia="Arial" w:hAnsi="Arial"/>
+          <w:b/>
+          <w:bCs/>
+          <w:color w:val="2E75B6"/>
+        </w:rPr>
+        <w:t>10.22 ArgoCD Ingress Invalid: INGRESS_HOST Placeholder Not Replaced</w:t>
+      </w:r>
+    </w:p>
+    <w:p>
+      <w:pPr>
+        <w:spacing w:after="160"/>
+      </w:pPr>
+      <w:r>
+        <w:rPr>
+          <w:rFonts w:ascii="Arial" w:cs="Arial" w:eastAsia="Arial" w:hAnsi="Arial"/>
+          <w:sz w:val="22"/>
+          <w:szCs w:val="22"/>
+        </w:rPr>
+        <w:t xml:space="preserve">Error: ArgoCD sync failed with “spec.rules[0].host: Invalid value: “INGRESS_HOST””. Root cause: k8s/ingress/ingress.yaml had a literal INGRESS_HOST placeholder that was never replaced. Fix: replaced INGRESS_HOST with the actual nip.io hostname (&lt;INGRESS-IP&gt;.nip.io). The nip.io service is a free DNS provider that resolves any IP-prefixed hostname (e.g., 20.108.134.194.nip.io) to that IP address, allowing a valid DNS hostname to be used in the Ingress spec without a custom domain.</w:t>
       </w:r>
     </w:p>
     <w:p>
@@ -5083,7 +5272,7 @@
                 <w:sz w:val="20"/>
                 <w:szCs w:val="20"/>
               </w:rPr>
-              <w:t xml:space="preserve">Trivy 0.50.4</w:t>
+              <w:t xml:space="preserve">Trivy 0.70.0</w:t>
             </w:r>
           </w:p>
         </w:tc>
@@ -5471,7 +5660,7 @@
                 <w:sz w:val="20"/>
                 <w:szCs w:val="20"/>
               </w:rPr>
-              <w:t xml:space="preserve">microservices-app synced and reached Healthy within 4 minutes</w:t>
+              <w:t xml:space="preserve">microservices-app synced — all 8 pods (2 replicas × 4 services) reached Healthy within 5 minutes</w:t>
             </w:r>
           </w:p>
         </w:tc>
@@ -5576,7 +5765,7 @@
           <w:sz w:val="18"/>
           <w:szCs w:val="18"/>
         </w:rPr>
-        <w:t xml:space="preserve">curl https://&lt;INGRESS_IP&gt;/api/students  → 200 OK with student list</w:t>
+        <w:t xml:space="preserve">curl -k https://&lt;INGRESS_IP&gt;.nip.io/api/students  → 200 OK with student list</w:t>
       </w:r>
     </w:p>
     <w:p>
@@ -5591,7 +5780,7 @@
           <w:sz w:val="18"/>
           <w:szCs w:val="18"/>
         </w:rPr>
-        <w:t xml:space="preserve">curl https://&lt;INGRESS_IP&gt;/api/courses   → 200 OK with course list</w:t>
+        <w:t xml:space="preserve">curl -k https://&lt;INGRESS_IP&gt;.nip.io/api/courses   → 200 OK with course list</w:t>
       </w:r>
     </w:p>
     <w:p>
@@ -5606,7 +5795,7 @@
           <w:sz w:val="18"/>
           <w:szCs w:val="18"/>
         </w:rPr>
-        <w:t xml:space="preserve">curl https://&lt;INGRESS_IP&gt;/api/reports/summary → 200 OK with GPA summary</w:t>
+        <w:t xml:space="preserve">curl -k https://&lt;INGRESS_IP&gt;.nip.io/api/reports/summary → 200 OK with GPA summary</w:t>
       </w:r>
     </w:p>
     <w:p>
@@ -7300,7 +7489,7 @@
                 <w:sz w:val="20"/>
                 <w:szCs w:val="20"/>
               </w:rPr>
-              <w:t xml:space="preserve">Removed --insecure from all argocd CLI commands. ArgoCD now requires TLS. The configmap argocd-cmd-params-cm patched to disable insecure mode.</w:t>
+              <w:t xml:space="preserve">ArgoCD uses a self-signed TLS certificate (provisioned by cert-manager selfsigned-issuer). The --insecure flag is required to skip certificate chain validation. --grpc-web is also required to avoid gRPC connection timeouts. In production: provision a CA-signed certificate to remove this flag.</w:t>
             </w:r>
           </w:p>
         </w:tc>

</xml_diff>